<commit_message>
fix: corregir los 7 defectos y las pruebas de decision/reconocimiento segun 1-TEORIA.md
El estudiante compartio 1-TEORIA.md (no disponible al inicio). La taxonomia
real de los 7 defectos (Intercambiable, Confunde mision con vision, Enumera
valores, Omite al destinatario, Extension desmedida, Contradice la practica,
Escrita por una sola persona) difiere de la reconstruccion generica usada
antes. Se corrigen el script, 2.1_mision.md, el informe y el README:
3 de 7 defectos aplican con evidencia, 2 no aplican y 2 no son evaluables
con informacion publica (se documenta asi en vez de forzar un veredicto).
Se corrigen tambien las preguntas literales de las pruebas de la decision
y del reconocimiento.

Co-Authored-By: Claude Sonnet 5 <noreply@anthropic.com>
</commit_message>
<xml_diff>
--- a/SI886-LAB-04_vargas.docx
+++ b/SI886-LAB-04_vargas.docx
@@ -427,7 +427,7 @@
       <w:pPr>
         <w:pStyle w:val="Ttulo1"/>
       </w:pPr>
-      <w:bookmarkStart w:id="0" w:name="_Toc239952218"/>
+      <w:bookmarkStart w:id="0" w:name="_Toc239953624"/>
       <w:r>
         <w:lastRenderedPageBreak/>
         <w:t>Índice</w:t>
@@ -446,7 +446,7 @@
           <w:kern w:val="2"/>
           <w:sz w:val="24"/>
           <w:szCs w:val="24"/>
-          <w:lang w:eastAsia="es-ES"/>
+          <w:lang w:val="es-ES" w:eastAsia="es-ES"/>
           <w14:ligatures w14:val="standardContextual"/>
         </w:rPr>
       </w:pPr>
@@ -459,7 +459,7 @@
       <w:r>
         <w:fldChar w:fldCharType="separate"/>
       </w:r>
-      <w:hyperlink w:anchor="_Toc239952218" w:history="1">
+      <w:hyperlink w:anchor="_Toc239953624" w:history="1">
         <w:r>
           <w:rPr>
             <w:rStyle w:val="Hipervnculo"/>
@@ -486,7 +486,7 @@
             <w:noProof/>
             <w:webHidden/>
           </w:rPr>
-          <w:instrText xml:space="preserve"> PAGEREF _Toc239952218 \h </w:instrText>
+          <w:instrText xml:space="preserve"> PAGEREF _Toc239953624 \h </w:instrText>
         </w:r>
         <w:r>
           <w:rPr>
@@ -529,11 +529,11 @@
           <w:kern w:val="2"/>
           <w:sz w:val="24"/>
           <w:szCs w:val="24"/>
-          <w:lang w:eastAsia="es-ES"/>
+          <w:lang w:val="es-ES" w:eastAsia="es-ES"/>
           <w14:ligatures w14:val="standardContextual"/>
         </w:rPr>
       </w:pPr>
-      <w:hyperlink w:anchor="_Toc239952219" w:history="1">
+      <w:hyperlink w:anchor="_Toc239953625" w:history="1">
         <w:r>
           <w:rPr>
             <w:rStyle w:val="Hipervnculo"/>
@@ -560,7 +560,7 @@
             <w:noProof/>
             <w:webHidden/>
           </w:rPr>
-          <w:instrText xml:space="preserve"> PAGEREF _Toc239952219 \h </w:instrText>
+          <w:instrText xml:space="preserve"> PAGEREF _Toc239953625 \h </w:instrText>
         </w:r>
         <w:r>
           <w:rPr>
@@ -603,11 +603,11 @@
           <w:kern w:val="2"/>
           <w:sz w:val="24"/>
           <w:szCs w:val="24"/>
-          <w:lang w:eastAsia="es-ES"/>
+          <w:lang w:val="es-ES" w:eastAsia="es-ES"/>
           <w14:ligatures w14:val="standardContextual"/>
         </w:rPr>
       </w:pPr>
-      <w:hyperlink w:anchor="_Toc239952220" w:history="1">
+      <w:hyperlink w:anchor="_Toc239953626" w:history="1">
         <w:r>
           <w:rPr>
             <w:rStyle w:val="Hipervnculo"/>
@@ -634,7 +634,7 @@
             <w:noProof/>
             <w:webHidden/>
           </w:rPr>
-          <w:instrText xml:space="preserve"> PAGEREF _Toc239952220 \h </w:instrText>
+          <w:instrText xml:space="preserve"> PAGEREF _Toc239953626 \h </w:instrText>
         </w:r>
         <w:r>
           <w:rPr>
@@ -677,11 +677,11 @@
           <w:kern w:val="2"/>
           <w:sz w:val="24"/>
           <w:szCs w:val="24"/>
-          <w:lang w:eastAsia="es-ES"/>
+          <w:lang w:val="es-ES" w:eastAsia="es-ES"/>
           <w14:ligatures w14:val="standardContextual"/>
         </w:rPr>
       </w:pPr>
-      <w:hyperlink w:anchor="_Toc239952221" w:history="1">
+      <w:hyperlink w:anchor="_Toc239953627" w:history="1">
         <w:r>
           <w:rPr>
             <w:rStyle w:val="Hipervnculo"/>
@@ -708,7 +708,7 @@
             <w:noProof/>
             <w:webHidden/>
           </w:rPr>
-          <w:instrText xml:space="preserve"> PAGEREF _Toc239952221 \h </w:instrText>
+          <w:instrText xml:space="preserve"> PAGEREF _Toc239953627 \h </w:instrText>
         </w:r>
         <w:r>
           <w:rPr>
@@ -751,11 +751,11 @@
           <w:kern w:val="2"/>
           <w:sz w:val="24"/>
           <w:szCs w:val="24"/>
-          <w:lang w:eastAsia="es-ES"/>
+          <w:lang w:val="es-ES" w:eastAsia="es-ES"/>
           <w14:ligatures w14:val="standardContextual"/>
         </w:rPr>
       </w:pPr>
-      <w:hyperlink w:anchor="_Toc239952222" w:history="1">
+      <w:hyperlink w:anchor="_Toc239953628" w:history="1">
         <w:r>
           <w:rPr>
             <w:rStyle w:val="Hipervnculo"/>
@@ -782,7 +782,7 @@
             <w:noProof/>
             <w:webHidden/>
           </w:rPr>
-          <w:instrText xml:space="preserve"> PAGEREF _Toc239952222 \h </w:instrText>
+          <w:instrText xml:space="preserve"> PAGEREF _Toc239953628 \h </w:instrText>
         </w:r>
         <w:r>
           <w:rPr>
@@ -825,11 +825,11 @@
           <w:kern w:val="2"/>
           <w:sz w:val="24"/>
           <w:szCs w:val="24"/>
-          <w:lang w:eastAsia="es-ES"/>
+          <w:lang w:val="es-ES" w:eastAsia="es-ES"/>
           <w14:ligatures w14:val="standardContextual"/>
         </w:rPr>
       </w:pPr>
-      <w:hyperlink w:anchor="_Toc239952223" w:history="1">
+      <w:hyperlink w:anchor="_Toc239953629" w:history="1">
         <w:r>
           <w:rPr>
             <w:rStyle w:val="Hipervnculo"/>
@@ -856,7 +856,7 @@
             <w:noProof/>
             <w:webHidden/>
           </w:rPr>
-          <w:instrText xml:space="preserve"> PAGEREF _Toc239952223 \h </w:instrText>
+          <w:instrText xml:space="preserve"> PAGEREF _Toc239953629 \h </w:instrText>
         </w:r>
         <w:r>
           <w:rPr>
@@ -899,11 +899,11 @@
           <w:kern w:val="2"/>
           <w:sz w:val="24"/>
           <w:szCs w:val="24"/>
-          <w:lang w:eastAsia="es-ES"/>
+          <w:lang w:val="es-ES" w:eastAsia="es-ES"/>
           <w14:ligatures w14:val="standardContextual"/>
         </w:rPr>
       </w:pPr>
-      <w:hyperlink w:anchor="_Toc239952224" w:history="1">
+      <w:hyperlink w:anchor="_Toc239953630" w:history="1">
         <w:r>
           <w:rPr>
             <w:rStyle w:val="Hipervnculo"/>
@@ -930,7 +930,7 @@
             <w:noProof/>
             <w:webHidden/>
           </w:rPr>
-          <w:instrText xml:space="preserve"> PAGEREF _Toc239952224 \h </w:instrText>
+          <w:instrText xml:space="preserve"> PAGEREF _Toc239953630 \h </w:instrText>
         </w:r>
         <w:r>
           <w:rPr>
@@ -973,11 +973,11 @@
           <w:kern w:val="2"/>
           <w:sz w:val="24"/>
           <w:szCs w:val="24"/>
-          <w:lang w:eastAsia="es-ES"/>
+          <w:lang w:val="es-ES" w:eastAsia="es-ES"/>
           <w14:ligatures w14:val="standardContextual"/>
         </w:rPr>
       </w:pPr>
-      <w:hyperlink w:anchor="_Toc239952225" w:history="1">
+      <w:hyperlink w:anchor="_Toc239953631" w:history="1">
         <w:r>
           <w:rPr>
             <w:rStyle w:val="Hipervnculo"/>
@@ -1004,7 +1004,7 @@
             <w:noProof/>
             <w:webHidden/>
           </w:rPr>
-          <w:instrText xml:space="preserve"> PAGEREF _Toc239952225 \h </w:instrText>
+          <w:instrText xml:space="preserve"> PAGEREF _Toc239953631 \h </w:instrText>
         </w:r>
         <w:r>
           <w:rPr>
@@ -1047,11 +1047,11 @@
           <w:kern w:val="2"/>
           <w:sz w:val="24"/>
           <w:szCs w:val="24"/>
-          <w:lang w:eastAsia="es-ES"/>
+          <w:lang w:val="es-ES" w:eastAsia="es-ES"/>
           <w14:ligatures w14:val="standardContextual"/>
         </w:rPr>
       </w:pPr>
-      <w:hyperlink w:anchor="_Toc239952226" w:history="1">
+      <w:hyperlink w:anchor="_Toc239953632" w:history="1">
         <w:r>
           <w:rPr>
             <w:rStyle w:val="Hipervnculo"/>
@@ -1078,7 +1078,7 @@
             <w:noProof/>
             <w:webHidden/>
           </w:rPr>
-          <w:instrText xml:space="preserve"> PAGEREF _Toc239952226 \h </w:instrText>
+          <w:instrText xml:space="preserve"> PAGEREF _Toc239953632 \h </w:instrText>
         </w:r>
         <w:r>
           <w:rPr>
@@ -1121,11 +1121,11 @@
           <w:kern w:val="2"/>
           <w:sz w:val="24"/>
           <w:szCs w:val="24"/>
-          <w:lang w:eastAsia="es-ES"/>
+          <w:lang w:val="es-ES" w:eastAsia="es-ES"/>
           <w14:ligatures w14:val="standardContextual"/>
         </w:rPr>
       </w:pPr>
-      <w:hyperlink w:anchor="_Toc239952227" w:history="1">
+      <w:hyperlink w:anchor="_Toc239953633" w:history="1">
         <w:r>
           <w:rPr>
             <w:rStyle w:val="Hipervnculo"/>
@@ -1152,7 +1152,7 @@
             <w:noProof/>
             <w:webHidden/>
           </w:rPr>
-          <w:instrText xml:space="preserve"> PAGEREF _Toc239952227 \h </w:instrText>
+          <w:instrText xml:space="preserve"> PAGEREF _Toc239953633 \h </w:instrText>
         </w:r>
         <w:r>
           <w:rPr>
@@ -1195,11 +1195,11 @@
           <w:kern w:val="2"/>
           <w:sz w:val="24"/>
           <w:szCs w:val="24"/>
-          <w:lang w:eastAsia="es-ES"/>
+          <w:lang w:val="es-ES" w:eastAsia="es-ES"/>
           <w14:ligatures w14:val="standardContextual"/>
         </w:rPr>
       </w:pPr>
-      <w:hyperlink w:anchor="_Toc239952228" w:history="1">
+      <w:hyperlink w:anchor="_Toc239953634" w:history="1">
         <w:r>
           <w:rPr>
             <w:rStyle w:val="Hipervnculo"/>
@@ -1226,7 +1226,7 @@
             <w:noProof/>
             <w:webHidden/>
           </w:rPr>
-          <w:instrText xml:space="preserve"> PAGEREF _Toc239952228 \h </w:instrText>
+          <w:instrText xml:space="preserve"> PAGEREF _Toc239953634 \h </w:instrText>
         </w:r>
         <w:r>
           <w:rPr>
@@ -1269,11 +1269,11 @@
           <w:kern w:val="2"/>
           <w:sz w:val="24"/>
           <w:szCs w:val="24"/>
-          <w:lang w:eastAsia="es-ES"/>
+          <w:lang w:val="es-ES" w:eastAsia="es-ES"/>
           <w14:ligatures w14:val="standardContextual"/>
         </w:rPr>
       </w:pPr>
-      <w:hyperlink w:anchor="_Toc239952229" w:history="1">
+      <w:hyperlink w:anchor="_Toc239953635" w:history="1">
         <w:r>
           <w:rPr>
             <w:rStyle w:val="Hipervnculo"/>
@@ -1300,7 +1300,7 @@
             <w:noProof/>
             <w:webHidden/>
           </w:rPr>
-          <w:instrText xml:space="preserve"> PAGEREF _Toc239952229 \h </w:instrText>
+          <w:instrText xml:space="preserve"> PAGEREF _Toc239953635 \h </w:instrText>
         </w:r>
         <w:r>
           <w:rPr>
@@ -1343,11 +1343,11 @@
           <w:kern w:val="2"/>
           <w:sz w:val="24"/>
           <w:szCs w:val="24"/>
-          <w:lang w:eastAsia="es-ES"/>
+          <w:lang w:val="es-ES" w:eastAsia="es-ES"/>
           <w14:ligatures w14:val="standardContextual"/>
         </w:rPr>
       </w:pPr>
-      <w:hyperlink w:anchor="_Toc239952230" w:history="1">
+      <w:hyperlink w:anchor="_Toc239953636" w:history="1">
         <w:r>
           <w:rPr>
             <w:rStyle w:val="Hipervnculo"/>
@@ -1374,7 +1374,7 @@
             <w:noProof/>
             <w:webHidden/>
           </w:rPr>
-          <w:instrText xml:space="preserve"> PAGEREF _Toc239952230 \h </w:instrText>
+          <w:instrText xml:space="preserve"> PAGEREF _Toc239953636 \h </w:instrText>
         </w:r>
         <w:r>
           <w:rPr>
@@ -1417,11 +1417,11 @@
           <w:kern w:val="2"/>
           <w:sz w:val="24"/>
           <w:szCs w:val="24"/>
-          <w:lang w:eastAsia="es-ES"/>
+          <w:lang w:val="es-ES" w:eastAsia="es-ES"/>
           <w14:ligatures w14:val="standardContextual"/>
         </w:rPr>
       </w:pPr>
-      <w:hyperlink w:anchor="_Toc239952231" w:history="1">
+      <w:hyperlink w:anchor="_Toc239953637" w:history="1">
         <w:r>
           <w:rPr>
             <w:rStyle w:val="Hipervnculo"/>
@@ -1448,7 +1448,7 @@
             <w:noProof/>
             <w:webHidden/>
           </w:rPr>
-          <w:instrText xml:space="preserve"> PAGEREF _Toc239952231 \h </w:instrText>
+          <w:instrText xml:space="preserve"> PAGEREF _Toc239953637 \h </w:instrText>
         </w:r>
         <w:r>
           <w:rPr>
@@ -1468,7 +1468,7 @@
             <w:noProof/>
             <w:webHidden/>
           </w:rPr>
-          <w:t>6</w:t>
+          <w:t>7</w:t>
         </w:r>
         <w:r>
           <w:rPr>
@@ -1491,11 +1491,11 @@
           <w:kern w:val="2"/>
           <w:sz w:val="24"/>
           <w:szCs w:val="24"/>
-          <w:lang w:eastAsia="es-ES"/>
+          <w:lang w:val="es-ES" w:eastAsia="es-ES"/>
           <w14:ligatures w14:val="standardContextual"/>
         </w:rPr>
       </w:pPr>
-      <w:hyperlink w:anchor="_Toc239952232" w:history="1">
+      <w:hyperlink w:anchor="_Toc239953638" w:history="1">
         <w:r>
           <w:rPr>
             <w:rStyle w:val="Hipervnculo"/>
@@ -1522,7 +1522,7 @@
             <w:noProof/>
             <w:webHidden/>
           </w:rPr>
-          <w:instrText xml:space="preserve"> PAGEREF _Toc239952232 \h </w:instrText>
+          <w:instrText xml:space="preserve"> PAGEREF _Toc239953638 \h </w:instrText>
         </w:r>
         <w:r>
           <w:rPr>
@@ -1565,11 +1565,11 @@
           <w:kern w:val="2"/>
           <w:sz w:val="24"/>
           <w:szCs w:val="24"/>
-          <w:lang w:eastAsia="es-ES"/>
+          <w:lang w:val="es-ES" w:eastAsia="es-ES"/>
           <w14:ligatures w14:val="standardContextual"/>
         </w:rPr>
       </w:pPr>
-      <w:hyperlink w:anchor="_Toc239952233" w:history="1">
+      <w:hyperlink w:anchor="_Toc239953639" w:history="1">
         <w:r>
           <w:rPr>
             <w:rStyle w:val="Hipervnculo"/>
@@ -1596,7 +1596,7 @@
             <w:noProof/>
             <w:webHidden/>
           </w:rPr>
-          <w:instrText xml:space="preserve"> PAGEREF _Toc239952233 \h </w:instrText>
+          <w:instrText xml:space="preserve"> PAGEREF _Toc239953639 \h </w:instrText>
         </w:r>
         <w:r>
           <w:rPr>
@@ -1639,11 +1639,11 @@
           <w:kern w:val="2"/>
           <w:sz w:val="24"/>
           <w:szCs w:val="24"/>
-          <w:lang w:eastAsia="es-ES"/>
+          <w:lang w:val="es-ES" w:eastAsia="es-ES"/>
           <w14:ligatures w14:val="standardContextual"/>
         </w:rPr>
       </w:pPr>
-      <w:hyperlink w:anchor="_Toc239952234" w:history="1">
+      <w:hyperlink w:anchor="_Toc239953640" w:history="1">
         <w:r>
           <w:rPr>
             <w:rStyle w:val="Hipervnculo"/>
@@ -1670,7 +1670,7 @@
             <w:noProof/>
             <w:webHidden/>
           </w:rPr>
-          <w:instrText xml:space="preserve"> PAGEREF _Toc239952234 \h </w:instrText>
+          <w:instrText xml:space="preserve"> PAGEREF _Toc239953640 \h </w:instrText>
         </w:r>
         <w:r>
           <w:rPr>
@@ -1713,11 +1713,11 @@
           <w:kern w:val="2"/>
           <w:sz w:val="24"/>
           <w:szCs w:val="24"/>
-          <w:lang w:eastAsia="es-ES"/>
+          <w:lang w:val="es-ES" w:eastAsia="es-ES"/>
           <w14:ligatures w14:val="standardContextual"/>
         </w:rPr>
       </w:pPr>
-      <w:hyperlink w:anchor="_Toc239952235" w:history="1">
+      <w:hyperlink w:anchor="_Toc239953641" w:history="1">
         <w:r>
           <w:rPr>
             <w:rStyle w:val="Hipervnculo"/>
@@ -1744,7 +1744,7 @@
             <w:noProof/>
             <w:webHidden/>
           </w:rPr>
-          <w:instrText xml:space="preserve"> PAGEREF _Toc239952235 \h </w:instrText>
+          <w:instrText xml:space="preserve"> PAGEREF _Toc239953641 \h </w:instrText>
         </w:r>
         <w:r>
           <w:rPr>
@@ -1764,7 +1764,7 @@
             <w:noProof/>
             <w:webHidden/>
           </w:rPr>
-          <w:t>9</w:t>
+          <w:t>10</w:t>
         </w:r>
         <w:r>
           <w:rPr>
@@ -1787,11 +1787,11 @@
           <w:kern w:val="2"/>
           <w:sz w:val="24"/>
           <w:szCs w:val="24"/>
-          <w:lang w:eastAsia="es-ES"/>
+          <w:lang w:val="es-ES" w:eastAsia="es-ES"/>
           <w14:ligatures w14:val="standardContextual"/>
         </w:rPr>
       </w:pPr>
-      <w:hyperlink w:anchor="_Toc239952236" w:history="1">
+      <w:hyperlink w:anchor="_Toc239953642" w:history="1">
         <w:r>
           <w:rPr>
             <w:rStyle w:val="Hipervnculo"/>
@@ -1818,7 +1818,7 @@
             <w:noProof/>
             <w:webHidden/>
           </w:rPr>
-          <w:instrText xml:space="preserve"> PAGEREF _Toc239952236 \h </w:instrText>
+          <w:instrText xml:space="preserve"> PAGEREF _Toc239953642 \h </w:instrText>
         </w:r>
         <w:r>
           <w:rPr>
@@ -1838,7 +1838,7 @@
             <w:noProof/>
             <w:webHidden/>
           </w:rPr>
-          <w:t>9</w:t>
+          <w:t>10</w:t>
         </w:r>
         <w:r>
           <w:rPr>
@@ -1861,11 +1861,11 @@
           <w:kern w:val="2"/>
           <w:sz w:val="24"/>
           <w:szCs w:val="24"/>
-          <w:lang w:eastAsia="es-ES"/>
+          <w:lang w:val="es-ES" w:eastAsia="es-ES"/>
           <w14:ligatures w14:val="standardContextual"/>
         </w:rPr>
       </w:pPr>
-      <w:hyperlink w:anchor="_Toc239952237" w:history="1">
+      <w:hyperlink w:anchor="_Toc239953643" w:history="1">
         <w:r>
           <w:rPr>
             <w:rStyle w:val="Hipervnculo"/>
@@ -1892,7 +1892,7 @@
             <w:noProof/>
             <w:webHidden/>
           </w:rPr>
-          <w:instrText xml:space="preserve"> PAGEREF _Toc239952237 \h </w:instrText>
+          <w:instrText xml:space="preserve"> PAGEREF _Toc239953643 \h </w:instrText>
         </w:r>
         <w:r>
           <w:rPr>
@@ -1938,7 +1938,7 @@
         <w:pStyle w:val="Ttulo1"/>
       </w:pPr>
       <w:bookmarkStart w:id="1" w:name="información-sobre-el-evento-práctico"/>
-      <w:bookmarkStart w:id="2" w:name="_Toc239952219"/>
+      <w:bookmarkStart w:id="2" w:name="_Toc239953625"/>
       <w:r>
         <w:lastRenderedPageBreak/>
         <w:t>1. Información sobre el evento práctico</w:t>
@@ -1950,7 +1950,7 @@
         <w:pStyle w:val="Ttulo2"/>
       </w:pPr>
       <w:bookmarkStart w:id="3" w:name="título-del-evento-práctico"/>
-      <w:bookmarkStart w:id="4" w:name="_Toc239952220"/>
+      <w:bookmarkStart w:id="4" w:name="_Toc239953626"/>
       <w:r>
         <w:t>1.1 Título del evento práctico</w:t>
       </w:r>
@@ -1966,7 +1966,7 @@
         <w:pStyle w:val="Ttulo2"/>
       </w:pPr>
       <w:bookmarkStart w:id="5" w:name="objetivos"/>
-      <w:bookmarkStart w:id="6" w:name="_Toc239952221"/>
+      <w:bookmarkStart w:id="6" w:name="_Toc239953627"/>
       <w:bookmarkEnd w:id="3"/>
       <w:r>
         <w:t>1.2 Objetivos</w:t>
@@ -2018,7 +2018,7 @@
         <w:pStyle w:val="Ttulo2"/>
       </w:pPr>
       <w:bookmarkStart w:id="7" w:name="tiempo-de-duración"/>
-      <w:bookmarkStart w:id="8" w:name="_Toc239952222"/>
+      <w:bookmarkStart w:id="8" w:name="_Toc239953628"/>
       <w:bookmarkEnd w:id="5"/>
       <w:r>
         <w:t>1.3 Tiempo de duración</w:t>
@@ -2035,7 +2035,7 @@
         <w:pStyle w:val="Ttulo2"/>
       </w:pPr>
       <w:bookmarkStart w:id="9" w:name="resultados-de-aprendizaje"/>
-      <w:bookmarkStart w:id="10" w:name="_Toc239952223"/>
+      <w:bookmarkStart w:id="10" w:name="_Toc239953629"/>
       <w:bookmarkEnd w:id="7"/>
       <w:r>
         <w:t>1.4 Resultados de aprendizaje</w:t>
@@ -2076,7 +2076,7 @@
         <w:pStyle w:val="Ttulo2"/>
       </w:pPr>
       <w:bookmarkStart w:id="11" w:name="recursos"/>
-      <w:bookmarkStart w:id="12" w:name="_Toc239952224"/>
+      <w:bookmarkStart w:id="12" w:name="_Toc239953630"/>
       <w:bookmarkEnd w:id="9"/>
       <w:r>
         <w:t>1.5 Recursos</w:t>
@@ -2282,7 +2282,7 @@
         <w:pStyle w:val="Ttulo2"/>
       </w:pPr>
       <w:bookmarkStart w:id="13" w:name="seguridad"/>
-      <w:bookmarkStart w:id="14" w:name="_Toc239952225"/>
+      <w:bookmarkStart w:id="14" w:name="_Toc239953631"/>
       <w:bookmarkEnd w:id="11"/>
       <w:r>
         <w:lastRenderedPageBreak/>
@@ -2327,7 +2327,7 @@
         <w:pStyle w:val="Ttulo1"/>
       </w:pPr>
       <w:bookmarkStart w:id="15" w:name="procedimiento-o-metodología"/>
-      <w:bookmarkStart w:id="16" w:name="_Toc239952226"/>
+      <w:bookmarkStart w:id="16" w:name="_Toc239953632"/>
       <w:bookmarkEnd w:id="1"/>
       <w:bookmarkEnd w:id="13"/>
       <w:r>
@@ -2348,7 +2348,7 @@
         <w:pStyle w:val="Ttulo2"/>
       </w:pPr>
       <w:bookmarkStart w:id="17" w:name="paso-a"/>
-      <w:bookmarkStart w:id="18" w:name="_Toc239952227"/>
+      <w:bookmarkStart w:id="18" w:name="_Toc239953633"/>
       <w:r>
         <w:t>Paso A</w:t>
       </w:r>
@@ -2374,7 +2374,7 @@
         </w:rPr>
         <w:lastRenderedPageBreak/>
         <w:drawing>
-          <wp:inline distT="0" distB="0" distL="0" distR="0" wp14:anchorId="1759CB2E" wp14:editId="6AD472FC">
+          <wp:inline distT="0" distB="0" distL="0" distR="0" wp14:anchorId="07269BBD" wp14:editId="6F315D00">
             <wp:extent cx="5029200" cy="2828925"/>
             <wp:effectExtent l="0" t="0" r="0" b="0"/>
             <wp:docPr id="1391959142" name="Picture 1391959142"/>
@@ -2432,7 +2432,7 @@
         <w:pStyle w:val="Ttulo2"/>
       </w:pPr>
       <w:bookmarkStart w:id="19" w:name="paso-b"/>
-      <w:bookmarkStart w:id="20" w:name="_Toc239952228"/>
+      <w:bookmarkStart w:id="20" w:name="_Toc239953634"/>
       <w:bookmarkEnd w:id="17"/>
       <w:r>
         <w:t>Paso B</w:t>
@@ -2451,7 +2451,7 @@
     </w:p>
     <w:p>
       <w:r>
-        <w:t>Resultado: 1 de 5 componentes presente, 7 de 7 defectos identificados, 0 de 3 pruebas de calidad superadas. Veredicto: SE REFORMULA (porta 3 componentes o menos).</w:t>
+        <w:t>Resultado: 1 de 5 componentes presente; 3 de 7 defectos confirmados con evidencia (Intercambiable, Confunde misión con visión, Omite al destinatario), 2 que no aplican y 2 no evaluables con información pública; 0 de 3 pruebas de calidad superadas. Veredicto: SE REFORMULA (porta 3 componentes o menos).</w:t>
       </w:r>
     </w:p>
     <w:p>
@@ -2462,8 +2462,9 @@
         <w:rPr>
           <w:noProof/>
         </w:rPr>
+        <w:lastRenderedPageBreak/>
         <w:drawing>
-          <wp:inline distT="0" distB="0" distL="0" distR="0" wp14:anchorId="734C0E20" wp14:editId="47C6E712">
+          <wp:inline distT="0" distB="0" distL="0" distR="0" wp14:anchorId="53C9C3CE" wp14:editId="7E69AAF2">
             <wp:extent cx="5029200" cy="3143250"/>
             <wp:effectExtent l="0" t="0" r="0" b="0"/>
             <wp:docPr id="1391959143" name="Picture 1391959143"/>
@@ -2508,130 +2509,126 @@
           <w:i/>
           <w:sz w:val="18"/>
         </w:rPr>
+        <w:t>Figura 1. Gráfico resumen del diagnóstico de la misión de Crehana.</w:t>
+      </w:r>
+    </w:p>
+    <w:p>
+      <w:r>
+        <w:t>Evidencia: https://github.com/AngelVargasGutierrez/PETI-TALLER4/blob/main/evidencias/S04/diagnostico.txt (salida completa del script) y https://github.com/AngelVargasGutierrez/PETI-TALLER4/blob/main/02_identidad/2.1_mision.md (diagnóstico redactado).</w:t>
+      </w:r>
+    </w:p>
+    <w:p>
+      <w:pPr>
+        <w:pStyle w:val="Ttulo2"/>
+      </w:pPr>
+      <w:bookmarkStart w:id="21" w:name="paso-c"/>
+      <w:bookmarkStart w:id="22" w:name="_Toc239953635"/>
+      <w:bookmarkEnd w:id="19"/>
+      <w:r>
+        <w:t>Paso C</w:t>
+      </w:r>
+      <w:bookmarkEnd w:id="22"/>
+    </w:p>
+    <w:p>
+      <w:r>
+        <w:t>Qué se buscaba: evaluar la visión vigente con los cinco atributos de la teoría y extraer sus métricas implícitas.</w:t>
+      </w:r>
+    </w:p>
+    <w:p>
+      <w:r>
+        <w:t>Acción: se revisó exhaustivamente la página oficial de Crehana; no se encontró ningún bloque titulado «Visión». Conforme a la instrucción del taller, esta ausencia se registró como hallazgo, y los cinco atributos se evaluaron sobre la declaración de impacto disponible («Impulsamos equipos. Potenciamos culturas. Transformamos resultados.»), dejando explícito que se trata de un sustituto y no de una visión declarada.</w:t>
+      </w:r>
+    </w:p>
+    <w:p>
+      <w:r>
+        <w:t>Resultado: 0 de 5 atributos cumplidos (uno no evaluable por ausencia de meta declarada). Se documentaron, en su lugar, las cifras reales que sí publica la empresa (más de 1200 empresas cliente en LATAM, 10 años de trayectoria) como línea base disponible para cualquier meta futura.</w:t>
+      </w:r>
+    </w:p>
+    <w:p>
+      <w:r>
+        <w:t>Evidencia: https://github.com/AngelVargasGutierrez/PETI-TALLER4/blob/main/02_identidad/2.2_vision.md</w:t>
+      </w:r>
+    </w:p>
+    <w:p>
+      <w:pPr>
+        <w:pStyle w:val="Ttulo2"/>
+      </w:pPr>
+      <w:bookmarkStart w:id="23" w:name="_Toc239953636"/>
+      <w:r>
+        <w:t>Paso D</w:t>
+      </w:r>
+      <w:bookmarkEnd w:id="23"/>
+    </w:p>
+    <w:p>
+      <w:r>
+        <w:t>Qué se buscaba: derivar la visión de la función de TI a partir de los elementos concretos de la identidad estratégica de la empresa, y redactar las Secciones 2.1 y 2.2 del PETI.</w:t>
+      </w:r>
+    </w:p>
+    <w:p>
+      <w:r>
+        <w:t>Acción: se tomaron los tres elementos concretos y verificables que sí declara Crehana en su página oficial (la unificación del recorrido del talento, la escala de más de 1200 empresas cliente en LATAM y la declaración de impacto sobre cultura y resultados) y, para cada uno, se derivó la capacidad de negocio y la capacidad de TI que la habilita, con su estado actual y su estado objetivo.</w:t>
+      </w:r>
+    </w:p>
+    <w:p>
+      <w:r>
         <w:lastRenderedPageBreak/>
-        <w:t>Figura 1. Gráfico resumen del diagnóstico de la misión de Crehana.</w:t>
-      </w:r>
-    </w:p>
-    <w:p>
-      <w:r>
-        <w:t>Evidencia: https://github.com/AngelVargasGutierrez/PETI-TALLER4/blob/main/evidencias/S04/diagnostico.txt (salida completa del script) y https://github.com/AngelVargasGutierrez/PETI-TALLER4/blob/main/02_identidad/2.1_mision.md (diagnóstico redactado).</w:t>
+        <w:t>Resultado: visión de la función de TI redactada (Sección 2.2.3) y tabla de derivación de tres filas (Sección 2.2.4), cada una trazable a un fragmento textual concreto de la página oficial de la empresa.</w:t>
+      </w:r>
+    </w:p>
+    <w:p>
+      <w:r>
+        <w:t>Evidencia: https://github.com/AngelVargasGutierrez/PETI-TALLER4/blob/main/02_identidad/2.2_vision.md</w:t>
       </w:r>
     </w:p>
     <w:p>
       <w:pPr>
         <w:pStyle w:val="Ttulo2"/>
       </w:pPr>
-      <w:bookmarkStart w:id="21" w:name="paso-c"/>
-      <w:bookmarkStart w:id="22" w:name="_Toc239952229"/>
-      <w:bookmarkEnd w:id="19"/>
-      <w:r>
-        <w:t>Paso C</w:t>
-      </w:r>
-      <w:bookmarkEnd w:id="22"/>
-    </w:p>
-    <w:p>
-      <w:r>
-        <w:t>Qué se buscaba: evaluar la visión vigente con los cinco atributos de la teoría y extraer sus métricas implícitas.</w:t>
-      </w:r>
-    </w:p>
-    <w:p>
-      <w:r>
-        <w:t>Acción: se revisó exhaustivamente la página oficial de Crehana; no se encontró ningún bloque titulado «Visión». Conforme a la instrucción del taller, esta ausencia se registró como hallazgo, y los cinco atributos se evaluaron sobre la declaración de impacto disponible («Impulsamos equipos. Potenciamos culturas. Transformamos resultados.»), dejando explícito que se trata de un sustituto y no de una visión declarada.</w:t>
-      </w:r>
-    </w:p>
-    <w:p>
-      <w:r>
-        <w:t>Resultado: 0 de 5 atributos cumplidos (uno no evaluable por ausencia de meta declarada). Se documentaron, en su lugar, las cifras reales que sí publica la empresa (más de 1200 empresas cliente en LATAM, 10 años de trayectoria) como línea base disponible para cualquier meta futura.</w:t>
-      </w:r>
-    </w:p>
-    <w:p>
-      <w:r>
-        <w:t>Evidencia: https://github.com/AngelVargasGutierrez/PETI-TALLER4/blob/main/02_identidad/2.2_vision.md</w:t>
+      <w:bookmarkStart w:id="24" w:name="_Toc239953637"/>
+      <w:r>
+        <w:t>Paso E</w:t>
+      </w:r>
+      <w:bookmarkEnd w:id="24"/>
+    </w:p>
+    <w:p>
+      <w:r>
+        <w:t>Qué se buscaba: validar el resultado con tres comprobaciones y corregir lo que fallara antes de cerrar la sesión.</w:t>
+      </w:r>
+    </w:p>
+    <w:p>
+      <w:pPr>
+        <w:pStyle w:val="Compact"/>
+      </w:pPr>
+      <w:r>
+        <w:t>•  Prueba de sustitución con un competidor real (Buk): la variante «La misión de Buk es construir equipos listos para el futuro» sigue sonando igual de creíble que el original — la declaración no dice nada propio de Crehana. Confirma el veredicto del Paso B.</w:t>
+      </w:r>
+    </w:p>
+    <w:p>
+      <w:pPr>
+        <w:pStyle w:val="Compact"/>
+      </w:pPr>
+      <w:r>
+        <w:t>•  Línea base de cada métrica de la visión, con su fuente: se comprobó que, al no existir una visión con metas propias, no hay ninguna cifra «implícita en la visión» que documentar; se registró honestamente esta ausencia en la Sección 2.2.2, en vez de inventar una meta que la empresa no ha declarado.</w:t>
+      </w:r>
+    </w:p>
+    <w:p>
+      <w:pPr>
+        <w:pStyle w:val="Compact"/>
+      </w:pPr>
+      <w:r>
+        <w:t>•  Cada fila de la tabla de derivación (Sección 2.2.4) se verificó contra el texto original de la página de Crehana: las tres provienen de fragmentos citados literalmente («unifica lo que antes estaba desconectado», «+1200 empresas», «Impulsamos equipos. Potenciamos culturas. Transformamos resultados.»), no de una idea del equipo sin respaldo textual.</w:t>
+      </w:r>
+    </w:p>
+    <w:p>
+      <w:r>
+        <w:t>Las tres comprobaciones se cumplieron correctamente en la primera ejecución; no fue necesario corregir ningún resultado antes de cerrar la sesión.</w:t>
       </w:r>
     </w:p>
     <w:p>
       <w:pPr>
         <w:pStyle w:val="Ttulo2"/>
       </w:pPr>
-      <w:bookmarkStart w:id="23" w:name="_Toc239952230"/>
-      <w:r>
-        <w:t>Paso D</w:t>
-      </w:r>
-      <w:bookmarkEnd w:id="23"/>
-    </w:p>
-    <w:p>
-      <w:r>
-        <w:t>Qué se buscaba: derivar la visión de la función de TI a partir de los elementos concretos de la identidad estratégica de la empresa, y redactar las Secciones 2.1 y 2.2 del PETI.</w:t>
-      </w:r>
-    </w:p>
-    <w:p>
-      <w:r>
-        <w:t>Acción: se tomaron los tres elementos concretos y verificables que sí declara Crehana en su página oficial (la unificación del recorrido del talento, la escala de más de 1200 empresas cliente en LATAM y la declaración de impacto sobre cultura y resultados) y, para cada uno, se derivó la capacidad de negocio y la capacidad de TI que la habilita, con su estado actual y su estado objetivo.</w:t>
-      </w:r>
-    </w:p>
-    <w:p>
-      <w:r>
-        <w:t>Resultado: visión de la función de TI redactada (Sección 2.2.3) y tabla de derivación de tres filas (Sección 2.2.4), cada una trazable a un fragmento textual concreto de la página oficial de la empresa.</w:t>
-      </w:r>
-    </w:p>
-    <w:p>
-      <w:r>
-        <w:t>Evidencia: https://github.com/AngelVargasGutierrez/PETI-TALLER4/blob/main/02_identidad/2.2_vision.md</w:t>
-      </w:r>
-    </w:p>
-    <w:p>
-      <w:pPr>
-        <w:pStyle w:val="Ttulo2"/>
-      </w:pPr>
-      <w:bookmarkStart w:id="24" w:name="_Toc239952231"/>
-      <w:r>
-        <w:t>Paso E</w:t>
-      </w:r>
-      <w:bookmarkEnd w:id="24"/>
-    </w:p>
-    <w:p>
-      <w:r>
-        <w:t>Qué se buscaba: validar el resultado con tres comprobaciones y corregir lo que fallara antes de cerrar la sesión.</w:t>
-      </w:r>
-    </w:p>
-    <w:p>
-      <w:pPr>
-        <w:pStyle w:val="Compact"/>
-      </w:pPr>
-      <w:r>
-        <w:t>•  Prueba de sustitución con un competidor real (Buk): la variante «La misión de Buk es construir equipos listos para el futuro» sigue sonando igual de creíble que el original — la declaración no dice nada propio de Crehana. Confirma el veredicto del Paso B.</w:t>
-      </w:r>
-    </w:p>
-    <w:p>
-      <w:pPr>
-        <w:pStyle w:val="Compact"/>
-      </w:pPr>
-      <w:r>
-        <w:t>•  Línea base de cada métrica de la visión, con su fuente: se comprobó que, al no existir una visión con metas propias, no hay ninguna cifra «implícita en la visión» que documentar; se registró honestamente esta ausencia en la Sección 2.2.2, en vez de inventar una meta que la empresa no ha declarado.</w:t>
-      </w:r>
-    </w:p>
-    <w:p>
-      <w:pPr>
-        <w:pStyle w:val="Compact"/>
-      </w:pPr>
-      <w:r>
-        <w:t xml:space="preserve">•  Cada fila de la tabla de derivación (Sección 2.2.4) se verificó contra el texto original de la página de Crehana: las tres provienen de fragmentos citados literalmente («unifica lo que antes </w:t>
-      </w:r>
-      <w:r>
-        <w:lastRenderedPageBreak/>
-        <w:t>estaba desconectado», «+1200 empresas», «Impulsamos equipos. Potenciamos culturas. Transformamos resultados.»), no de una idea del equipo sin respaldo textual.</w:t>
-      </w:r>
-    </w:p>
-    <w:p>
-      <w:r>
-        <w:t>Las tres comprobaciones se cumplieron correctamente en la primera ejecución; no fue necesario corregir ningún resultado antes de cerrar la sesión.</w:t>
-      </w:r>
-    </w:p>
-    <w:p>
-      <w:pPr>
-        <w:pStyle w:val="Ttulo2"/>
-      </w:pPr>
-      <w:bookmarkStart w:id="25" w:name="_Toc239952232"/>
+      <w:bookmarkStart w:id="25" w:name="_Toc239953638"/>
       <w:r>
         <w:t>Paso F</w:t>
       </w:r>
@@ -2649,7 +2646,10 @@
     </w:p>
     <w:p>
       <w:r>
-        <w:t>Pregunta de transferencia — ¿qué riesgo correría una organización real si esto se hiciera mal? Si Crehana invirtiera en TI a partir de una misión y una visión genéricas y sin verificar, el portafolio de proyectos terminaría financiando capacidades que no se distinguen de las de cualquier competidor, sin ninguna métrica que permita comprobar si la inversión realmente acercó a la empresa al futuro que promete. La ausencia de una visión con metas verificables, además, deja a la función de TI sin un criterio objetivo para decidir qué proyecto priorizar primero.</w:t>
+        <w:t>Pregunta de transferencia — ¿qué riesgo correría una organización real si esto se hiciera mal? Si Crehana invirtiera en TI a partir de una misión y una visión genéricas y sin verificar, el portafolio de proyectos terminaría financiando capacidades que no se distinguen de las de cualquier competidor, sin ninguna métrica que permita comprobar si la inversión realmente acercó a la empresa al futuro que promete. La ausencia de una visión con metas verificables, además, deja a la función de TI sin un criterio ob</w:t>
+      </w:r>
+      <w:r>
+        <w:t>jetivo para decidir qué proyecto priorizar primero.</w:t>
       </w:r>
     </w:p>
     <w:p>
@@ -2657,7 +2657,7 @@
         <w:pStyle w:val="Ttulo1"/>
       </w:pPr>
       <w:bookmarkStart w:id="26" w:name="resultados"/>
-      <w:bookmarkStart w:id="27" w:name="_Toc239952233"/>
+      <w:bookmarkStart w:id="27" w:name="_Toc239953639"/>
       <w:bookmarkEnd w:id="15"/>
       <w:bookmarkEnd w:id="21"/>
       <w:r>
@@ -2784,6 +2784,7 @@
           </w:tcPr>
           <w:p>
             <w:r>
+              <w:lastRenderedPageBreak/>
               <w:t>2</w:t>
             </w:r>
           </w:p>
@@ -2878,11 +2879,7 @@
           </w:tcPr>
           <w:p>
             <w:r>
-              <w:t xml:space="preserve">Los siete defectos revisados, señalados con su nombre técnico y su </w:t>
-            </w:r>
-            <w:r>
-              <w:lastRenderedPageBreak/>
-              <w:t>prueba</w:t>
+              <w:t>Los siete defectos revisados, señalados con su nombre técnico y su prueba</w:t>
             </w:r>
           </w:p>
         </w:tc>
@@ -2892,8 +2889,7 @@
           </w:tcPr>
           <w:p>
             <w:r>
-              <w:lastRenderedPageBreak/>
-              <w:t>Sí (7/7 aplican)</w:t>
+              <w:t>Sí (3/7 aplican; 2 no aplican; 2 no evaluables con información pública)</w:t>
             </w:r>
           </w:p>
         </w:tc>
@@ -3103,7 +3099,11 @@
           </w:tcPr>
           <w:p>
             <w:r>
-              <w:t>Parcial — documentado el hallazgo de ausencia de visión, con las cifras reales disponibles como línea base</w:t>
+              <w:t xml:space="preserve">Parcial — documentado el hallazgo de ausencia de visión, con las cifras reales </w:t>
+            </w:r>
+            <w:r>
+              <w:lastRenderedPageBreak/>
+              <w:t>disponibles como línea base</w:t>
             </w:r>
           </w:p>
         </w:tc>
@@ -3113,6 +3113,7 @@
           </w:tcPr>
           <w:p>
             <w:r>
+              <w:lastRenderedPageBreak/>
               <w:t>https://github.com/AngelVargasGutierrez/PETI-TALLER4/blob/main/02_identidad/2.2_vision.md</w:t>
             </w:r>
           </w:p>
@@ -3209,11 +3210,7 @@
           </w:tcPr>
           <w:p>
             <w:r>
-              <w:t>1</w:t>
-            </w:r>
-            <w:r>
-              <w:lastRenderedPageBreak/>
-              <w:t>2</w:t>
+              <w:t>12</w:t>
             </w:r>
           </w:p>
         </w:tc>
@@ -3223,12 +3220,7 @@
           </w:tcPr>
           <w:p>
             <w:r>
-              <w:lastRenderedPageBreak/>
-              <w:t xml:space="preserve">Tabla de derivación con </w:t>
-            </w:r>
-            <w:r>
-              <w:lastRenderedPageBreak/>
-              <w:t>estado actual y estado objetivo por capacidad</w:t>
+              <w:t>Tabla de derivación con estado actual y estado objetivo por capacidad</w:t>
             </w:r>
           </w:p>
         </w:tc>
@@ -3238,7 +3230,6 @@
           </w:tcPr>
           <w:p>
             <w:r>
-              <w:lastRenderedPageBreak/>
               <w:t>Sí</w:t>
             </w:r>
           </w:p>
@@ -3249,11 +3240,7 @@
           </w:tcPr>
           <w:p>
             <w:r>
-              <w:t>https://github.com/AngelVargasGutierrez/PETI-</w:t>
-            </w:r>
-            <w:r>
-              <w:lastRenderedPageBreak/>
-              <w:t>TALLER4/blob/main/02_identidad/2.2_vision.md</w:t>
+              <w:t>https://github.com/AngelVargasGutierrez/PETI-TALLER4/blob/main/02_identidad/2.2_vision.md</w:t>
             </w:r>
           </w:p>
         </w:tc>
@@ -3265,7 +3252,6 @@
           </w:tcPr>
           <w:p>
             <w:r>
-              <w:lastRenderedPageBreak/>
               <w:t>13</w:t>
             </w:r>
           </w:p>
@@ -3312,7 +3298,7 @@
         <w:pStyle w:val="Ttulo1"/>
       </w:pPr>
       <w:bookmarkStart w:id="28" w:name="conclusiones"/>
-      <w:bookmarkStart w:id="29" w:name="_Toc239952234"/>
+      <w:bookmarkStart w:id="29" w:name="_Toc239953640"/>
       <w:bookmarkEnd w:id="26"/>
       <w:r>
         <w:t>4. Conclusiones</w:t>
@@ -3332,7 +3318,10 @@
         <w:pStyle w:val="Compact"/>
       </w:pPr>
       <w:r>
-        <w:t>•  Nombrar el defecto con su término técnico y probarlo con evidencia textual — y no con una impresión como «es muy general» — es lo único que sostiene una recomendación ante la alta dirección: de los siete defectos evaluados sobre la misión de Crehana, los siete aplicaban, cada uno con su fragmento de evidencia específico.</w:t>
+        <w:t>•  Nombrar el defecto con su término técnico y probarlo con evidencia textual — y no con una impresión como «es muy general» — es lo único que sostiene una recomendación ante la alta dirección: de los siete defectos evaluados sobre la misión de Crehana, tres aplicaban con evidencia directa (intercambiable, confunde misión con visión, omite al destinatario) y dos no pudieron evaluarse por falta de acceso a información interna de la empresa — se documentó esa limitación con honestidad en vez de forzar un vere</w:t>
+      </w:r>
+      <w:r>
+        <w:t>dicto sin evidencia.</w:t>
       </w:r>
     </w:p>
     <w:p>
@@ -3348,7 +3337,11 @@
         <w:pStyle w:val="Compact"/>
       </w:pPr>
       <w:r>
-        <w:t>•  Derivar la visión de TI directamente de fragmentos textuales verificables — y no de una idea del equipo — es lo único que permite trazar cada capacidad de TI de la Sección 2.2.4 hasta su origen concreto en lo que la empresa realmente declara, insumo que después ordena el portafolio de proyectos del PETI.</w:t>
+        <w:t xml:space="preserve">•  Derivar la visión de TI directamente de fragmentos textuales verificables — y no de una idea del equipo — es lo único que permite trazar cada capacidad de TI de la Sección 2.2.4 hasta su </w:t>
+      </w:r>
+      <w:r>
+        <w:lastRenderedPageBreak/>
+        <w:t>origen concreto en lo que la empresa realmente declara, insumo que después ordena el portafolio de proyectos del PETI.</w:t>
       </w:r>
     </w:p>
     <w:p>
@@ -3356,7 +3349,7 @@
         <w:pStyle w:val="Ttulo1"/>
       </w:pPr>
       <w:bookmarkStart w:id="30" w:name="cuestionario"/>
-      <w:bookmarkStart w:id="31" w:name="_Toc239952235"/>
+      <w:bookmarkStart w:id="31" w:name="_Toc239953641"/>
       <w:bookmarkEnd w:id="28"/>
       <w:r>
         <w:t>5. Cuestionario</w:t>
@@ -3397,7 +3390,7 @@
         <w:pStyle w:val="Ttulo1"/>
       </w:pPr>
       <w:bookmarkStart w:id="32" w:name="referencias-bibliográficas"/>
-      <w:bookmarkStart w:id="33" w:name="_Toc239952236"/>
+      <w:bookmarkStart w:id="33" w:name="_Toc239953642"/>
       <w:bookmarkEnd w:id="30"/>
       <w:r>
         <w:t>6. Referencias bibliográficas</w:t>
@@ -3411,69 +3404,72 @@
     </w:p>
     <w:p>
       <w:r>
+        <w:t>González Millán, J. (2020). Manual práctico de planeación estratégica. Ediciones Díaz de Santos. https://elibro.net/es/lc/bibliotecaupt/titulos/129291</w:t>
+      </w:r>
+    </w:p>
+    <w:p>
+      <w:r>
+        <w:t>García Sánchez, E. y Valencia Velazco, M. L. Planeación estratégica: teoría y práctica. Trillas.</w:t>
+      </w:r>
+    </w:p>
+    <w:p>
+      <w:r>
+        <w:t>Rodríguez Bermúdez, J. R. (2015). Planificación y dirección estratégica de sistemas de información. Editorial UOC. https://elibro.net/es/lc/bibliotecaupt/titulos/57875</w:t>
+      </w:r>
+    </w:p>
+    <w:p>
+      <w:r>
+        <w:t>Collins, J. y Porras, J. (1996). Building your company's vision. Harvard Business Review, 74(5), 65–77.</w:t>
+      </w:r>
+    </w:p>
+    <w:p>
+      <w:r>
+        <w:t>Bart, C. K. (1997). Sex, lies, and mission statements. Business Horizons, 40(6), 9–18.</w:t>
+      </w:r>
+    </w:p>
+    <w:p>
+      <w:r>
+        <w:t>CEPLAN. Guía para el Planeamiento Institucional — formulación de la misión institucional. https://www.gob.pe/ceplan</w:t>
+      </w:r>
+    </w:p>
+    <w:p>
+      <w:r>
+        <w:t>Resolución de Secretaría de Gobierno Digital 005-2018-PCM/SEGDI — Anexo I. https://cdn.www.gob.pe/uploads/document/file/356863/Anexo_I_Lineamientos_PGD.pdf</w:t>
+      </w:r>
+    </w:p>
+    <w:p>
+      <w:pPr>
+        <w:pStyle w:val="Ttulo1"/>
+      </w:pPr>
+      <w:bookmarkStart w:id="34" w:name="_Toc239953643"/>
+      <w:bookmarkEnd w:id="32"/>
+      <w:r>
+        <w:t>7. Anexos</w:t>
+      </w:r>
+      <w:bookmarkEnd w:id="34"/>
+    </w:p>
+    <w:p>
+      <w:r>
+        <w:t>Anexo A — captura de la página oficial de Crehana, con la dirección y la fecha visibles (incluida en el cuerpo del informe, Paso A, y en https://github.com/AngelVargasGutierrez/PETI-TALLER4/blob/main/evidencias/S04/anexo_A_crehana_pagina.png).</w:t>
+      </w:r>
+    </w:p>
+    <w:p>
+      <w:r>
+        <w:t>Anexo B — salida completa del diagnóstico: https://github.com/AngelVargasGutierrez/PETI-TALLER4/blob/main/evidencias/S04/diagnostico.txt</w:t>
+      </w:r>
+    </w:p>
+    <w:p>
+      <w:r>
+        <w:t>Anexo C — gráfico del diagnóstico (incluido en el cuerpo del informe, Paso B, y en https://github.com/AngelVargasGutierrez/PETI-TALLER4/blob/main/graficos/S04_diagnostico.png).</w:t>
+      </w:r>
+    </w:p>
+    <w:p>
+      <w:r>
+        <w:t>Anexo D — Secciones 2.1 y 2.2 del PETI en formato versionable: https://github.com/AngelVargasGutierrez/PETI-</w:t>
+      </w:r>
+      <w:r>
         <w:lastRenderedPageBreak/>
-        <w:t>González Millán, J. (2020). Manual práctico de planeación estratégica. Ediciones Díaz de Santos. https://elibro.net/es/lc/bibliotecaupt/titulos/129291</w:t>
-      </w:r>
-    </w:p>
-    <w:p>
-      <w:r>
-        <w:t>García Sánchez, E. y Valencia Velazco, M. L. Planeación estratégica: teoría y práctica. Trillas.</w:t>
-      </w:r>
-    </w:p>
-    <w:p>
-      <w:r>
-        <w:t>Rodríguez Bermúdez, J. R. (2015). Planificación y dirección estratégica de sistemas de información. Editorial UOC. https://elibro.net/es/lc/bibliotecaupt/titulos/57875</w:t>
-      </w:r>
-    </w:p>
-    <w:p>
-      <w:r>
-        <w:t>Collins, J. y Porras, J. (1996). Building your company's vision. Harvard Business Review, 74(5), 65–77.</w:t>
-      </w:r>
-    </w:p>
-    <w:p>
-      <w:r>
-        <w:t>Bart, C. K. (1997). Sex, lies, and mission statements. Business Horizons, 40(6), 9–18.</w:t>
-      </w:r>
-    </w:p>
-    <w:p>
-      <w:r>
-        <w:t>CEPLAN. Guía para el Planeamiento Institucional — formulación de la misión institucional. https://www.gob.pe/ceplan</w:t>
-      </w:r>
-    </w:p>
-    <w:p>
-      <w:r>
-        <w:t>Resolución de Secretaría de Gobierno Digital 005-2018-PCM/SEGDI — Anexo I. https://cdn.www.gob.pe/uploads/document/file/356863/Anexo_I_Lineamientos_PGD.pdf</w:t>
-      </w:r>
-    </w:p>
-    <w:p>
-      <w:pPr>
-        <w:pStyle w:val="Ttulo1"/>
-      </w:pPr>
-      <w:bookmarkStart w:id="34" w:name="_Toc239952237"/>
-      <w:bookmarkEnd w:id="32"/>
-      <w:r>
-        <w:t>7. Anexos</w:t>
-      </w:r>
-      <w:bookmarkEnd w:id="34"/>
-    </w:p>
-    <w:p>
-      <w:r>
-        <w:t>Anexo A — captura de la página oficial de Crehana, con la dirección y la fecha visibles (incluida en el cuerpo del informe, Paso A, y en https://github.com/AngelVargasGutierrez/PETI-TALLER4/blob/main/evidencias/S04/anexo_A_crehana_pagina.png).</w:t>
-      </w:r>
-    </w:p>
-    <w:p>
-      <w:r>
-        <w:t>Anexo B — salida completa del diagnóstico: https://github.com/AngelVargasGutierrez/PETI-TALLER4/blob/main/evidencias/S04/diagnostico.txt</w:t>
-      </w:r>
-    </w:p>
-    <w:p>
-      <w:r>
-        <w:t>Anexo C — gráfico del diagnóstico (incluido en el cuerpo del informe, Paso B, y en https://github.com/AngelVargasGutierrez/PETI-TALLER4/blob/main/graficos/S04_diagnostico.png).</w:t>
-      </w:r>
-    </w:p>
-    <w:p>
-      <w:r>
-        <w:t>Anexo D — Secciones 2.1 y 2.2 del PETI en formato versionable: https://github.com/AngelVargasGutierrez/PETI-TALLER4/blob/main/02_identidad/2.1_mision.md y https://github.com/AngelVargasGutierrez/PETI-TALLER4/blob/main/02_identidad/2.2_vision.md</w:t>
+        <w:t>TALLER4/blob/main/02_identidad/2.1_mision.md y https://github.com/AngelVargasGutierrez/PETI-TALLER4/blob/main/02_identidad/2.2_vision.md</w:t>
       </w:r>
     </w:p>
     <w:p>
@@ -3905,7 +3901,7 @@
         <w:rFonts w:ascii="Arial" w:eastAsia="Arial" w:hAnsi="Arial" w:cs="Arial"/>
         <w:sz w:val="22"/>
         <w:szCs w:val="22"/>
-        <w:lang w:val="es-ES" w:eastAsia="en-US" w:bidi="ar-SA"/>
+        <w:lang w:eastAsia="en-US" w:bidi="ar-SA"/>
       </w:rPr>
     </w:rPrDefault>
     <w:pPrDefault>

</xml_diff>